<commit_message>
PLC data: tipi di presa con i nomi della pagina Size Data (A, Indip. Standard, Reinforced, Indip. in line)
Co-Authored-By: Claude Opus 5.5 <noreply@anthropic.com>
Claude-Session: https://claude.ai/code/session_0186naTfQvFfqibW8eKgkc5K
</commit_message>
<xml_diff>
--- a/PalComposeGuide.docx
+++ b/PalComposeGuide.docx
@@ -5309,7 +5309,7 @@
         <w:t xml:space="preserve">A</w:t>
       </w:r>
       <w:r>
-        <w:t xml:space="preserve"> → aggiunge un deposito di tipo A (prelievo con il canale A). Disabilitato con tipo di prelievo 2 (solo AB).</w:t>
+        <w:t xml:space="preserve"> → aggiunge un deposito di tipo A (prelievo con il canale A). Disabilitato con testa A + B Reinforced.</w:t>
       </w:r>
     </w:p>
     <w:p>
@@ -5330,7 +5330,7 @@
         <w:t xml:space="preserve">B</w:t>
       </w:r>
       <w:r>
-        <w:t xml:space="preserve"> → aggiunge un deposito di tipo B (prelievo con il canale B). Abilitato solo con tipo di prelievo 1 o 3 (deposito diviso in A e B).</w:t>
+        <w:t xml:space="preserve"> → aggiunge un deposito di tipo B (prelievo con il canale B). Abilitato solo con testa A + B Indip. Standard o Indip. in line (deposito diviso in A e B).</w:t>
       </w:r>
     </w:p>
     <w:p>
@@ -5351,7 +5351,7 @@
         <w:t xml:space="preserve">AB</w:t>
       </w:r>
       <w:r>
-        <w:t xml:space="preserve"> → aggiunge un deposito completo AB (entrambi i canali). Abilitato con tipo di prelievo 1, 2 o 3.</w:t>
+        <w:t xml:space="preserve"> → aggiunge un deposito completo AB (entrambi i canali). Abilitato con tutte le teste A + B.</w:t>
       </w:r>
     </w:p>
     <w:p>
@@ -6481,7 +6481,7 @@
         <w:t xml:space="preserve">Pick type</w:t>
       </w:r>
       <w:r>
-        <w:t xml:space="preserve"> → tipo di prelievo: 0 = solo A; 1 = A + B diviso lungo X; 2 = solo AB; 3 = A + B diviso lungo Y. Con 0 e 2 il deposito viene preso in un’unica presa; con 1 e 3 viene diviso in una parte A e una parte B (vedere “Tipologie di canali di aspirazione”).</w:t>
+        <w:t xml:space="preserve"> → tipo di testa, come nella pagina Size Data: A; A + B Indip. Standard (deposito diviso in A e B lungo X); A + B Reinforced (i due canali lavorano insieme, deposito intero AB); A + B Indip. in line (deposito diviso in A e B lungo Y). Con A e A + B Reinforced il deposito viene preso in un’unica presa (vedere “Tipologie di canali di aspirazione”).</w:t>
       </w:r>
     </w:p>
     <w:p>
@@ -6523,7 +6523,7 @@
         <w:t xml:space="preserve">Cases in A (split)</w:t>
       </w:r>
       <w:r>
-        <w:t xml:space="preserve"> → solo con tipo di prelievo 1 o 3: numero di casse (righe) del deposito prese dal canale A.</w:t>
+        <w:t xml:space="preserve"> → solo con A + B Indip. Standard o Indip. in line: numero di casse (righe) del deposito prese dal canale A.</w:t>
       </w:r>
     </w:p>
     <w:p>
@@ -6544,7 +6544,7 @@
         <w:t xml:space="preserve">Cases in B (split)</w:t>
       </w:r>
       <w:r>
-        <w:t xml:space="preserve"> → calcolato automaticamente: casse rimanenti, prese dal canale B. Con tipo di prelievo 0 o 2 i due campi sono disattivati e B vale 0, perché il deposito non viene diviso.</w:t>
+        <w:t xml:space="preserve"> → calcolato automaticamente: casse rimanenti, prese dal canale B. Con A e A + B Reinforced i due campi sono disattivati e B vale 0, perché il deposito non viene diviso.</w:t>
       </w:r>
     </w:p>
     <w:p>
@@ -6667,7 +6667,7 @@
         <w:jc w:val="both"/>
       </w:pPr>
       <w:r>
-        <w:t xml:space="preserve">Esempio: con Cases per deposit X = 2, Cases per deposit Y = 1 e Pick type = 1, impostando Cases in A = 1 si ottiene Cases in B = 1: ogni deposito AB è formato da 2 casse, una presa dal canale A e una dal canale B, e diventano disponibili i pulsanti A, B e AB.</w:t>
+        <w:t xml:space="preserve">Esempio: con Cases per deposit X = 2, Cases per deposit Y = 1 e Pick type = A + B Indip. Standard, impostando Cases in A = 1 si ottiene Cases in B = 1: ogni deposito AB è formato da 2 casse, una presa dal canale A e una dal canale B, e diventano disponibili i pulsanti A, B e AB.</w:t>
       </w:r>
     </w:p>
     <w:p>

</xml_diff>

<commit_message>
Presa divisa non valida bloccata, simulazione robot con doppia presa A+B
- PLC data: con Indip. Standard / in line e una sola cassa sull'asse diviso compare un avviso
  e Apply resta disattivato (prima si creava un deposito B di larghezza 0)
- Pulsanti A/B/AB disattivati se il deposito ha una dimensione nulla (anche con dati dal PLC)
- 3D: con sequenza ottimizzata (picktype AB + Nothing) il robot prende A e B insieme,
  posa il primo, risale e posa il secondo
- Guida aggiornata

Co-Authored-By: Claude Opus 5.5 <noreply@anthropic.com>
Claude-Session: https://claude.ai/code/session_0186naTfQvFfqibW8eKgkc5K
</commit_message>
<xml_diff>
--- a/PalComposeGuide.docx
+++ b/PalComposeGuide.docx
@@ -6094,6 +6094,22 @@
         <w:jc w:val="both"/>
       </w:pPr>
       <w:r>
+        <w:rPr>
+          <w:b/>
+          <w:bCs/>
+        </w:rPr>
+        <w:t xml:space="preserve">Doppia presa A + B.</w:t>
+      </w:r>
+      <w:r>
+        <w:t xml:space="preserve"> Se la composizione arriva dal PLC con la sequenza di prelievo ottimizzata (opzione “Ottimizza Pick-Up Sequence” al salvataggio), due depositi consecutivi A e B arrivano insieme sul nastro. Il robot li prende con una sola presa, posa il primo rilasciando solo il suo canale, risale, si sposta sul secondo e lo posa. Durante la doppia presa la barra mostra “(A+B pick)”. Le parti A e B sono disposte sulla testa come nella macchina: in modalità standard A davanti e B dietro, in modalità in linea A a sinistra e B a destra.</w:t>
+      </w:r>
+    </w:p>
+    <w:p>
+      <w:pPr>
+        <w:spacing w:line="360" w:lineRule="auto"/>
+        <w:jc w:val="both"/>
+      </w:pPr>
+      <w:r>
         <w:t xml:space="preserve">Comandi della barra di simulazione:</w:t>
       </w:r>
     </w:p>
@@ -6524,6 +6540,27 @@
       </w:r>
       <w:r>
         <w:t xml:space="preserve"> → solo con A + B Indip. Standard o Indip. in line: numero di casse (righe) del deposito prese dal canale A.</w:t>
+      </w:r>
+    </w:p>
+    <w:p>
+      <w:pPr>
+        <w:pStyle w:val="Paragrafoelenco"/>
+        <w:numPr>
+          <w:ilvl w:val="0"/>
+          <w:numId w:val="52"/>
+        </w:numPr>
+        <w:spacing w:line="360" w:lineRule="auto"/>
+        <w:jc w:val="both"/>
+      </w:pPr>
+      <w:r>
+        <w:rPr>
+          <w:b/>
+          <w:bCs/>
+        </w:rPr>
+        <w:t xml:space="preserve">Avviso in rosso</w:t>
+      </w:r>
+      <w:r>
+        <w:t xml:space="preserve"> → con A + B Indip. Standard il deposito si divide lungo X, con Indip. in line lungo Y (scambiati se Picking wheel rotated è attivo): sull’asse diviso servono almeno 2 casse. Altrimenti compare un avviso e Apply / Apply &amp; clear restano disattivati.</w:t>
       </w:r>
     </w:p>
     <w:p>

</xml_diff>